<commit_message>
docs: preparar branding demo expo venezuela energetica
</commit_message>
<xml_diff>
--- a/docs/Guia_Pruebas_Cliente_Potencial_EventPass.docx
+++ b/docs/Guia_Pruebas_Cliente_Potencial_EventPass.docx
@@ -11,10 +11,10 @@
         <w:rPr>
           <w:rFonts w:ascii="Calibri" w:hAnsi="Calibri"/>
           <w:b/>
-          <w:color w:val="009B77"/>
+          <w:color w:val="339E48"/>
           <w:sz w:val="26"/>
         </w:rPr>
-        <w:t>EVENTPASS VE</w:t>
+        <w:t>EXPO VENEZUELA ENERGÉTICA 2026</w:t>
       </w:r>
     </w:p>
     <w:p>
@@ -26,7 +26,7 @@
         <w:rPr>
           <w:rFonts w:ascii="Calibri" w:hAnsi="Calibri"/>
           <w:b/>
-          <w:color w:val="073B4C"/>
+          <w:color w:val="25245B"/>
           <w:sz w:val="56"/>
         </w:rPr>
         <w:t>Guía de pruebas para cliente potencial</w:t>
@@ -34,7 +34,7 @@
     </w:p>
     <w:p>
       <w:pPr>
-        <w:spacing w:before="0" w:after="560" w:line="276" w:lineRule="auto"/>
+        <w:spacing w:before="0" w:after="400" w:line="276" w:lineRule="auto"/>
         <w:jc w:val="center"/>
       </w:pPr>
       <w:r>
@@ -56,6 +56,242 @@
         <w:tblLook w:firstColumn="1" w:firstRow="1" w:lastColumn="0" w:lastRow="0" w:noHBand="0" w:noVBand="1" w:val="04A0"/>
       </w:tblPr>
       <w:tblGrid>
+        <w:gridCol w:w="2520"/>
+        <w:gridCol w:w="2520"/>
+        <w:gridCol w:w="2520"/>
+        <w:gridCol w:w="2520"/>
+      </w:tblGrid>
+      <w:tr>
+        <w:tc>
+          <w:tcPr>
+            <w:tcW w:type="dxa" w:w="2340"/>
+            <w:shd w:fill="25245B"/>
+            <w:tcMar>
+              <w:top w:w="90" w:type="dxa"/>
+              <w:start w:w="120" w:type="dxa"/>
+              <w:bottom w:w="90" w:type="dxa"/>
+              <w:end w:w="120" w:type="dxa"/>
+            </w:tcMar>
+            <w:vAlign w:val="center"/>
+          </w:tcPr>
+          <w:p>
+            <w:pPr>
+              <w:spacing w:before="0" w:after="0" w:line="276" w:lineRule="auto"/>
+            </w:pPr>
+            <w:r>
+              <w:rPr>
+                <w:rFonts w:ascii="Calibri" w:hAnsi="Calibri"/>
+                <w:b/>
+                <w:color w:val="FFFFFF"/>
+                <w:sz w:val="18"/>
+              </w:rPr>
+              <w:t>Color principal</w:t>
+            </w:r>
+          </w:p>
+        </w:tc>
+        <w:tc>
+          <w:tcPr>
+            <w:tcW w:type="dxa" w:w="2340"/>
+            <w:shd w:fill="25245B"/>
+            <w:tcMar>
+              <w:top w:w="90" w:type="dxa"/>
+              <w:start w:w="120" w:type="dxa"/>
+              <w:bottom w:w="90" w:type="dxa"/>
+              <w:end w:w="120" w:type="dxa"/>
+            </w:tcMar>
+            <w:vAlign w:val="center"/>
+          </w:tcPr>
+          <w:p>
+            <w:pPr>
+              <w:spacing w:before="0" w:after="0" w:line="276" w:lineRule="auto"/>
+            </w:pPr>
+            <w:r>
+              <w:rPr>
+                <w:rFonts w:ascii="Calibri" w:hAnsi="Calibri"/>
+                <w:b/>
+                <w:color w:val="FFFFFF"/>
+                <w:sz w:val="18"/>
+              </w:rPr>
+              <w:t>Color operativo</w:t>
+            </w:r>
+          </w:p>
+        </w:tc>
+        <w:tc>
+          <w:tcPr>
+            <w:tcW w:type="dxa" w:w="2340"/>
+            <w:shd w:fill="25245B"/>
+            <w:tcMar>
+              <w:top w:w="90" w:type="dxa"/>
+              <w:start w:w="120" w:type="dxa"/>
+              <w:bottom w:w="90" w:type="dxa"/>
+              <w:end w:w="120" w:type="dxa"/>
+            </w:tcMar>
+            <w:vAlign w:val="center"/>
+          </w:tcPr>
+          <w:p>
+            <w:pPr>
+              <w:spacing w:before="0" w:after="0" w:line="276" w:lineRule="auto"/>
+            </w:pPr>
+            <w:r>
+              <w:rPr>
+                <w:rFonts w:ascii="Calibri" w:hAnsi="Calibri"/>
+                <w:b/>
+                <w:color w:val="FFFFFF"/>
+                <w:sz w:val="18"/>
+              </w:rPr>
+              <w:t>Color de aviso</w:t>
+            </w:r>
+          </w:p>
+        </w:tc>
+        <w:tc>
+          <w:tcPr>
+            <w:tcW w:type="dxa" w:w="2340"/>
+            <w:shd w:fill="25245B"/>
+            <w:tcMar>
+              <w:top w:w="90" w:type="dxa"/>
+              <w:start w:w="120" w:type="dxa"/>
+              <w:bottom w:w="90" w:type="dxa"/>
+              <w:end w:w="120" w:type="dxa"/>
+            </w:tcMar>
+            <w:vAlign w:val="center"/>
+          </w:tcPr>
+          <w:p>
+            <w:pPr>
+              <w:spacing w:before="0" w:after="0" w:line="276" w:lineRule="auto"/>
+            </w:pPr>
+            <w:r>
+              <w:rPr>
+                <w:rFonts w:ascii="Calibri" w:hAnsi="Calibri"/>
+                <w:b/>
+                <w:color w:val="FFFFFF"/>
+                <w:sz w:val="18"/>
+              </w:rPr>
+              <w:t>Color destacado</w:t>
+            </w:r>
+          </w:p>
+        </w:tc>
+      </w:tr>
+      <w:tr>
+        <w:tc>
+          <w:tcPr>
+            <w:tcW w:type="dxa" w:w="2340"/>
+            <w:tcMar>
+              <w:top w:w="90" w:type="dxa"/>
+              <w:start w:w="120" w:type="dxa"/>
+              <w:bottom w:w="90" w:type="dxa"/>
+              <w:end w:w="120" w:type="dxa"/>
+            </w:tcMar>
+            <w:vAlign w:val="top"/>
+          </w:tcPr>
+          <w:p>
+            <w:pPr>
+              <w:spacing w:before="0" w:after="0" w:line="276" w:lineRule="auto"/>
+            </w:pPr>
+            <w:r>
+              <w:rPr>
+                <w:rFonts w:ascii="Calibri" w:hAnsi="Calibri"/>
+                <w:b w:val="0"/>
+                <w:color w:val="000000"/>
+                <w:sz w:val="19"/>
+              </w:rPr>
+              <w:t>#25245B Azul marino</w:t>
+            </w:r>
+          </w:p>
+        </w:tc>
+        <w:tc>
+          <w:tcPr>
+            <w:tcW w:type="dxa" w:w="2340"/>
+            <w:tcMar>
+              <w:top w:w="90" w:type="dxa"/>
+              <w:start w:w="120" w:type="dxa"/>
+              <w:bottom w:w="90" w:type="dxa"/>
+              <w:end w:w="120" w:type="dxa"/>
+            </w:tcMar>
+            <w:vAlign w:val="top"/>
+          </w:tcPr>
+          <w:p>
+            <w:pPr>
+              <w:spacing w:before="0" w:after="0" w:line="276" w:lineRule="auto"/>
+            </w:pPr>
+            <w:r>
+              <w:rPr>
+                <w:rFonts w:ascii="Calibri" w:hAnsi="Calibri"/>
+                <w:b w:val="0"/>
+                <w:color w:val="000000"/>
+                <w:sz w:val="19"/>
+              </w:rPr>
+              <w:t>#339E48 Verde</w:t>
+            </w:r>
+          </w:p>
+        </w:tc>
+        <w:tc>
+          <w:tcPr>
+            <w:tcW w:type="dxa" w:w="2340"/>
+            <w:tcMar>
+              <w:top w:w="90" w:type="dxa"/>
+              <w:start w:w="120" w:type="dxa"/>
+              <w:bottom w:w="90" w:type="dxa"/>
+              <w:end w:w="120" w:type="dxa"/>
+            </w:tcMar>
+            <w:vAlign w:val="top"/>
+          </w:tcPr>
+          <w:p>
+            <w:pPr>
+              <w:spacing w:before="0" w:after="0" w:line="276" w:lineRule="auto"/>
+            </w:pPr>
+            <w:r>
+              <w:rPr>
+                <w:rFonts w:ascii="Calibri" w:hAnsi="Calibri"/>
+                <w:b w:val="0"/>
+                <w:color w:val="000000"/>
+                <w:sz w:val="19"/>
+              </w:rPr>
+              <w:t>#DF2A27 Rojo</w:t>
+            </w:r>
+          </w:p>
+        </w:tc>
+        <w:tc>
+          <w:tcPr>
+            <w:tcW w:type="dxa" w:w="2340"/>
+            <w:tcMar>
+              <w:top w:w="90" w:type="dxa"/>
+              <w:start w:w="120" w:type="dxa"/>
+              <w:bottom w:w="90" w:type="dxa"/>
+              <w:end w:w="120" w:type="dxa"/>
+            </w:tcMar>
+            <w:vAlign w:val="top"/>
+          </w:tcPr>
+          <w:p>
+            <w:pPr>
+              <w:spacing w:before="0" w:after="0" w:line="276" w:lineRule="auto"/>
+            </w:pPr>
+            <w:r>
+              <w:rPr>
+                <w:rFonts w:ascii="Calibri" w:hAnsi="Calibri"/>
+                <w:b w:val="0"/>
+                <w:color w:val="000000"/>
+                <w:sz w:val="19"/>
+              </w:rPr>
+              <w:t>#FFCE07 Amarillo</w:t>
+            </w:r>
+          </w:p>
+        </w:tc>
+      </w:tr>
+    </w:tbl>
+    <w:p>
+      <w:pPr>
+        <w:spacing w:after="60"/>
+      </w:pPr>
+    </w:p>
+    <w:tbl>
+      <w:tblPr>
+        <w:tblStyle w:val="TableGrid"/>
+        <w:tblW w:type="auto" w:w="0"/>
+        <w:jc w:val="left"/>
+        <w:tblLayout w:type="fixed"/>
+        <w:tblLook w:firstColumn="1" w:firstRow="1" w:lastColumn="0" w:lastRow="0" w:noHBand="0" w:noVBand="1" w:val="04A0"/>
+      </w:tblPr>
+      <w:tblGrid>
         <w:gridCol w:w="3360"/>
         <w:gridCol w:w="3360"/>
         <w:gridCol w:w="3360"/>
@@ -64,7 +300,7 @@
         <w:tc>
           <w:tcPr>
             <w:tcW w:type="dxa" w:w="2600"/>
-            <w:shd w:fill="073B4C"/>
+            <w:shd w:fill="25245B"/>
             <w:tcMar>
               <w:top w:w="90" w:type="dxa"/>
               <w:start w:w="120" w:type="dxa"/>
@@ -91,7 +327,7 @@
         <w:tc>
           <w:tcPr>
             <w:tcW w:type="dxa" w:w="2300"/>
-            <w:shd w:fill="073B4C"/>
+            <w:shd w:fill="25245B"/>
             <w:tcMar>
               <w:top w:w="90" w:type="dxa"/>
               <w:start w:w="120" w:type="dxa"/>
@@ -118,7 +354,7 @@
         <w:tc>
           <w:tcPr>
             <w:tcW w:type="dxa" w:w="4460"/>
-            <w:shd w:fill="073B4C"/>
+            <w:shd w:fill="25245B"/>
             <w:tcMar>
               <w:top w:w="90" w:type="dxa"/>
               <w:start w:w="120" w:type="dxa"/>
@@ -243,7 +479,7 @@
         <w:tc>
           <w:tcPr>
             <w:tcW w:type="dxa" w:w="9360"/>
-            <w:shd w:fill="E8F7F2"/>
+            <w:shd w:fill="EDF8EF"/>
             <w:tcMar>
               <w:top w:w="140" w:type="dxa"/>
               <w:start w:w="180" w:type="dxa"/>
@@ -259,7 +495,7 @@
               <w:rPr>
                 <w:rFonts w:ascii="Calibri" w:hAnsi="Calibri"/>
                 <w:b/>
-                <w:color w:val="073B4C"/>
+                <w:color w:val="25245B"/>
                 <w:sz w:val="20"/>
               </w:rPr>
               <w:t>Antes de comenzar</w:t>
@@ -296,7 +532,7 @@
         <w:rPr>
           <w:rFonts w:ascii="Calibri" w:hAnsi="Calibri"/>
           <w:b/>
-          <w:color w:val="009B77"/>
+          <w:color w:val="339E48"/>
           <w:sz w:val="32"/>
         </w:rPr>
         <w:t>Enlaces de la demostración</w:t>
@@ -318,7 +554,7 @@
       <w:hyperlink r:id="rId11">
         <w:r>
           <w:rPr>
-            <w:color w:val="009B77"/>
+            <w:color w:val="339E48"/>
             <w:u w:val="single"/>
           </w:rPr>
           <w:t>https://eventosfacil.net/</w:t>
@@ -341,7 +577,7 @@
       <w:hyperlink r:id="rId12">
         <w:r>
           <w:rPr>
-            <w:color w:val="009B77"/>
+            <w:color w:val="339E48"/>
             <w:u w:val="single"/>
           </w:rPr>
           <w:t>https://eventosfacil.net/admin/login</w:t>
@@ -364,7 +600,7 @@
       <w:hyperlink r:id="rId13">
         <w:r>
           <w:rPr>
-            <w:color w:val="009B77"/>
+            <w:color w:val="339E48"/>
             <w:u w:val="single"/>
           </w:rPr>
           <w:t>https://eventosfacil.net/admin</w:t>
@@ -387,7 +623,7 @@
       <w:hyperlink r:id="rId14">
         <w:r>
           <w:rPr>
-            <w:color w:val="009B77"/>
+            <w:color w:val="339E48"/>
             <w:u w:val="single"/>
           </w:rPr>
           <w:t>https://eventosfacil.net/admin/eventos</w:t>
@@ -410,7 +646,7 @@
       <w:hyperlink r:id="rId15">
         <w:r>
           <w:rPr>
-            <w:color w:val="009B77"/>
+            <w:color w:val="339E48"/>
             <w:u w:val="single"/>
           </w:rPr>
           <w:t>https://eventosfacil.net/admin/acreditacion</w:t>
@@ -433,7 +669,7 @@
       <w:hyperlink r:id="rId16">
         <w:r>
           <w:rPr>
-            <w:color w:val="009B77"/>
+            <w:color w:val="339E48"/>
             <w:u w:val="single"/>
           </w:rPr>
           <w:t>https://eventosfacil.net/admin/checkin</w:t>
@@ -468,7 +704,7 @@
         <w:rPr>
           <w:rFonts w:ascii="Calibri" w:hAnsi="Calibri"/>
           <w:b/>
-          <w:color w:val="009B77"/>
+          <w:color w:val="339E48"/>
           <w:sz w:val="32"/>
         </w:rPr>
         <w:t>Cómo completar esta guía</w:t>
@@ -533,7 +769,7 @@
         <w:tc>
           <w:tcPr>
             <w:tcW w:type="dxa" w:w="9360"/>
-            <w:shd w:fill="E8F7F2"/>
+            <w:shd w:fill="EDF8EF"/>
             <w:tcMar>
               <w:top w:w="140" w:type="dxa"/>
               <w:start w:w="180" w:type="dxa"/>
@@ -549,7 +785,7 @@
               <w:rPr>
                 <w:rFonts w:ascii="Calibri" w:hAnsi="Calibri"/>
                 <w:b/>
-                <w:color w:val="073B4C"/>
+                <w:color w:val="25245B"/>
                 <w:sz w:val="20"/>
               </w:rPr>
               <w:t>Resultado esperado</w:t>
@@ -586,7 +822,7 @@
         <w:rPr>
           <w:rFonts w:ascii="Calibri" w:hAnsi="Calibri"/>
           <w:b/>
-          <w:color w:val="073B4C"/>
+          <w:color w:val="25245B"/>
           <w:sz w:val="26"/>
         </w:rPr>
         <w:t>Resumen de recorrido</w:t>
@@ -609,7 +845,7 @@
         <w:tc>
           <w:tcPr>
             <w:tcW w:type="dxa" w:w="1650"/>
-            <w:shd w:fill="073B4C"/>
+            <w:shd w:fill="25245B"/>
             <w:tcMar>
               <w:top w:w="90" w:type="dxa"/>
               <w:start w:w="120" w:type="dxa"/>
@@ -636,7 +872,7 @@
         <w:tc>
           <w:tcPr>
             <w:tcW w:type="dxa" w:w="4300"/>
-            <w:shd w:fill="073B4C"/>
+            <w:shd w:fill="25245B"/>
             <w:tcMar>
               <w:top w:w="90" w:type="dxa"/>
               <w:start w:w="120" w:type="dxa"/>
@@ -663,7 +899,7 @@
         <w:tc>
           <w:tcPr>
             <w:tcW w:type="dxa" w:w="3410"/>
-            <w:shd w:fill="073B4C"/>
+            <w:shd w:fill="25245B"/>
             <w:tcMar>
               <w:top w:w="90" w:type="dxa"/>
               <w:start w:w="120" w:type="dxa"/>
@@ -1188,7 +1424,7 @@
         <w:rPr>
           <w:rFonts w:ascii="Calibri" w:hAnsi="Calibri"/>
           <w:b/>
-          <w:color w:val="009B77"/>
+          <w:color w:val="339E48"/>
           <w:sz w:val="32"/>
         </w:rPr>
         <w:t>1. Panel del organizador y preparación del evento</w:t>
@@ -1217,7 +1453,7 @@
         <w:rPr>
           <w:rFonts w:ascii="Calibri" w:hAnsi="Calibri"/>
           <w:b/>
-          <w:color w:val="073B4C"/>
+          <w:color w:val="25245B"/>
           <w:sz w:val="26"/>
         </w:rPr>
         <w:t>Paso 1</w:t>
@@ -1251,7 +1487,7 @@
         <w:tc>
           <w:tcPr>
             <w:tcW w:type="dxa" w:w="9360"/>
-            <w:shd w:fill="F3F6F7"/>
+            <w:shd w:fill="F5F4FA"/>
             <w:tcMar>
               <w:top w:w="140" w:type="dxa"/>
               <w:start w:w="180" w:type="dxa"/>
@@ -1267,7 +1503,7 @@
               <w:rPr>
                 <w:rFonts w:ascii="Calibri" w:hAnsi="Calibri"/>
                 <w:b/>
-                <w:color w:val="073B4C"/>
+                <w:color w:val="25245B"/>
                 <w:sz w:val="20"/>
               </w:rPr>
               <w:t>Debe ocurrir</w:t>
@@ -1304,7 +1540,7 @@
         <w:rPr>
           <w:rFonts w:ascii="Calibri" w:hAnsi="Calibri"/>
           <w:b/>
-          <w:color w:val="073B4C"/>
+          <w:color w:val="25245B"/>
           <w:sz w:val="26"/>
         </w:rPr>
         <w:t>Paso 2</w:t>
@@ -1338,7 +1574,7 @@
         <w:tc>
           <w:tcPr>
             <w:tcW w:type="dxa" w:w="9360"/>
-            <w:shd w:fill="F3F6F7"/>
+            <w:shd w:fill="F5F4FA"/>
             <w:tcMar>
               <w:top w:w="140" w:type="dxa"/>
               <w:start w:w="180" w:type="dxa"/>
@@ -1354,7 +1590,7 @@
               <w:rPr>
                 <w:rFonts w:ascii="Calibri" w:hAnsi="Calibri"/>
                 <w:b/>
-                <w:color w:val="073B4C"/>
+                <w:color w:val="25245B"/>
                 <w:sz w:val="20"/>
               </w:rPr>
               <w:t>Debe ocurrir</w:t>
@@ -1391,7 +1627,7 @@
         <w:rPr>
           <w:rFonts w:ascii="Calibri" w:hAnsi="Calibri"/>
           <w:b/>
-          <w:color w:val="073B4C"/>
+          <w:color w:val="25245B"/>
           <w:sz w:val="26"/>
         </w:rPr>
         <w:t>Paso 3</w:t>
@@ -1425,7 +1661,7 @@
         <w:tc>
           <w:tcPr>
             <w:tcW w:type="dxa" w:w="9360"/>
-            <w:shd w:fill="F3F6F7"/>
+            <w:shd w:fill="F5F4FA"/>
             <w:tcMar>
               <w:top w:w="140" w:type="dxa"/>
               <w:start w:w="180" w:type="dxa"/>
@@ -1441,7 +1677,7 @@
               <w:rPr>
                 <w:rFonts w:ascii="Calibri" w:hAnsi="Calibri"/>
                 <w:b/>
-                <w:color w:val="073B4C"/>
+                <w:color w:val="25245B"/>
                 <w:sz w:val="20"/>
               </w:rPr>
               <w:t>Debe ocurrir</w:t>
@@ -1485,7 +1721,7 @@
         <w:tc>
           <w:tcPr>
             <w:tcW w:type="dxa" w:w="3800"/>
-            <w:shd w:fill="073B4C"/>
+            <w:shd w:fill="25245B"/>
             <w:tcMar>
               <w:top w:w="90" w:type="dxa"/>
               <w:start w:w="120" w:type="dxa"/>
@@ -1512,7 +1748,7 @@
         <w:tc>
           <w:tcPr>
             <w:tcW w:type="dxa" w:w="5560"/>
-            <w:shd w:fill="073B4C"/>
+            <w:shd w:fill="25245B"/>
             <w:tcMar>
               <w:top w:w="90" w:type="dxa"/>
               <w:start w:w="120" w:type="dxa"/>
@@ -1610,7 +1846,7 @@
         <w:rPr>
           <w:rFonts w:ascii="Calibri" w:hAnsi="Calibri"/>
           <w:b/>
-          <w:color w:val="009B77"/>
+          <w:color w:val="339E48"/>
           <w:sz w:val="32"/>
         </w:rPr>
         <w:t>2. Registro del participante, correo y credencial</w:t>
@@ -1639,7 +1875,7 @@
         <w:rPr>
           <w:rFonts w:ascii="Calibri" w:hAnsi="Calibri"/>
           <w:b/>
-          <w:color w:val="073B4C"/>
+          <w:color w:val="25245B"/>
           <w:sz w:val="26"/>
         </w:rPr>
         <w:t>Paso 1</w:t>
@@ -1673,7 +1909,7 @@
         <w:tc>
           <w:tcPr>
             <w:tcW w:type="dxa" w:w="9360"/>
-            <w:shd w:fill="F3F6F7"/>
+            <w:shd w:fill="F5F4FA"/>
             <w:tcMar>
               <w:top w:w="140" w:type="dxa"/>
               <w:start w:w="180" w:type="dxa"/>
@@ -1689,7 +1925,7 @@
               <w:rPr>
                 <w:rFonts w:ascii="Calibri" w:hAnsi="Calibri"/>
                 <w:b/>
-                <w:color w:val="073B4C"/>
+                <w:color w:val="25245B"/>
                 <w:sz w:val="20"/>
               </w:rPr>
               <w:t>Debe ocurrir</w:t>
@@ -1726,7 +1962,7 @@
         <w:rPr>
           <w:rFonts w:ascii="Calibri" w:hAnsi="Calibri"/>
           <w:b/>
-          <w:color w:val="073B4C"/>
+          <w:color w:val="25245B"/>
           <w:sz w:val="26"/>
         </w:rPr>
         <w:t>Paso 2</w:t>
@@ -1760,7 +1996,7 @@
         <w:tc>
           <w:tcPr>
             <w:tcW w:type="dxa" w:w="9360"/>
-            <w:shd w:fill="F3F6F7"/>
+            <w:shd w:fill="F5F4FA"/>
             <w:tcMar>
               <w:top w:w="140" w:type="dxa"/>
               <w:start w:w="180" w:type="dxa"/>
@@ -1776,7 +2012,7 @@
               <w:rPr>
                 <w:rFonts w:ascii="Calibri" w:hAnsi="Calibri"/>
                 <w:b/>
-                <w:color w:val="073B4C"/>
+                <w:color w:val="25245B"/>
                 <w:sz w:val="20"/>
               </w:rPr>
               <w:t>Debe ocurrir</w:t>
@@ -1813,7 +2049,7 @@
         <w:rPr>
           <w:rFonts w:ascii="Calibri" w:hAnsi="Calibri"/>
           <w:b/>
-          <w:color w:val="073B4C"/>
+          <w:color w:val="25245B"/>
           <w:sz w:val="26"/>
         </w:rPr>
         <w:t>Paso 3</w:t>
@@ -1847,7 +2083,7 @@
         <w:tc>
           <w:tcPr>
             <w:tcW w:type="dxa" w:w="9360"/>
-            <w:shd w:fill="F3F6F7"/>
+            <w:shd w:fill="F5F4FA"/>
             <w:tcMar>
               <w:top w:w="140" w:type="dxa"/>
               <w:start w:w="180" w:type="dxa"/>
@@ -1863,7 +2099,7 @@
               <w:rPr>
                 <w:rFonts w:ascii="Calibri" w:hAnsi="Calibri"/>
                 <w:b/>
-                <w:color w:val="073B4C"/>
+                <w:color w:val="25245B"/>
                 <w:sz w:val="20"/>
               </w:rPr>
               <w:t>Debe ocurrir</w:t>
@@ -1900,7 +2136,7 @@
         <w:rPr>
           <w:rFonts w:ascii="Calibri" w:hAnsi="Calibri"/>
           <w:b/>
-          <w:color w:val="073B4C"/>
+          <w:color w:val="25245B"/>
           <w:sz w:val="26"/>
         </w:rPr>
         <w:t>Paso 4</w:t>
@@ -1934,7 +2170,7 @@
         <w:tc>
           <w:tcPr>
             <w:tcW w:type="dxa" w:w="9360"/>
-            <w:shd w:fill="F3F6F7"/>
+            <w:shd w:fill="F5F4FA"/>
             <w:tcMar>
               <w:top w:w="140" w:type="dxa"/>
               <w:start w:w="180" w:type="dxa"/>
@@ -1950,7 +2186,7 @@
               <w:rPr>
                 <w:rFonts w:ascii="Calibri" w:hAnsi="Calibri"/>
                 <w:b/>
-                <w:color w:val="073B4C"/>
+                <w:color w:val="25245B"/>
                 <w:sz w:val="20"/>
               </w:rPr>
               <w:t>Debe ocurrir</w:t>
@@ -1994,7 +2230,7 @@
         <w:tc>
           <w:tcPr>
             <w:tcW w:type="dxa" w:w="3800"/>
-            <w:shd w:fill="073B4C"/>
+            <w:shd w:fill="25245B"/>
             <w:tcMar>
               <w:top w:w="90" w:type="dxa"/>
               <w:start w:w="120" w:type="dxa"/>
@@ -2021,7 +2257,7 @@
         <w:tc>
           <w:tcPr>
             <w:tcW w:type="dxa" w:w="5560"/>
-            <w:shd w:fill="073B4C"/>
+            <w:shd w:fill="25245B"/>
             <w:tcMar>
               <w:top w:w="90" w:type="dxa"/>
               <w:start w:w="120" w:type="dxa"/>
@@ -2119,7 +2355,7 @@
         <w:rPr>
           <w:rFonts w:ascii="Calibri" w:hAnsi="Calibri"/>
           <w:b/>
-          <w:color w:val="009B77"/>
+          <w:color w:val="339E48"/>
           <w:sz w:val="32"/>
         </w:rPr>
         <w:t>3. Agenda y pantalla pública para el público</w:t>
@@ -2148,7 +2384,7 @@
         <w:rPr>
           <w:rFonts w:ascii="Calibri" w:hAnsi="Calibri"/>
           <w:b/>
-          <w:color w:val="073B4C"/>
+          <w:color w:val="25245B"/>
           <w:sz w:val="26"/>
         </w:rPr>
         <w:t>Paso 1</w:t>
@@ -2182,7 +2418,7 @@
         <w:tc>
           <w:tcPr>
             <w:tcW w:type="dxa" w:w="9360"/>
-            <w:shd w:fill="F3F6F7"/>
+            <w:shd w:fill="F5F4FA"/>
             <w:tcMar>
               <w:top w:w="140" w:type="dxa"/>
               <w:start w:w="180" w:type="dxa"/>
@@ -2198,7 +2434,7 @@
               <w:rPr>
                 <w:rFonts w:ascii="Calibri" w:hAnsi="Calibri"/>
                 <w:b/>
-                <w:color w:val="073B4C"/>
+                <w:color w:val="25245B"/>
                 <w:sz w:val="20"/>
               </w:rPr>
               <w:t>Debe ocurrir</w:t>
@@ -2235,7 +2471,7 @@
         <w:rPr>
           <w:rFonts w:ascii="Calibri" w:hAnsi="Calibri"/>
           <w:b/>
-          <w:color w:val="073B4C"/>
+          <w:color w:val="25245B"/>
           <w:sz w:val="26"/>
         </w:rPr>
         <w:t>Paso 2</w:t>
@@ -2269,7 +2505,7 @@
         <w:tc>
           <w:tcPr>
             <w:tcW w:type="dxa" w:w="9360"/>
-            <w:shd w:fill="F3F6F7"/>
+            <w:shd w:fill="F5F4FA"/>
             <w:tcMar>
               <w:top w:w="140" w:type="dxa"/>
               <w:start w:w="180" w:type="dxa"/>
@@ -2285,7 +2521,7 @@
               <w:rPr>
                 <w:rFonts w:ascii="Calibri" w:hAnsi="Calibri"/>
                 <w:b/>
-                <w:color w:val="073B4C"/>
+                <w:color w:val="25245B"/>
                 <w:sz w:val="20"/>
               </w:rPr>
               <w:t>Debe ocurrir</w:t>
@@ -2322,7 +2558,7 @@
         <w:rPr>
           <w:rFonts w:ascii="Calibri" w:hAnsi="Calibri"/>
           <w:b/>
-          <w:color w:val="073B4C"/>
+          <w:color w:val="25245B"/>
           <w:sz w:val="26"/>
         </w:rPr>
         <w:t>Paso 3</w:t>
@@ -2356,7 +2592,7 @@
         <w:tc>
           <w:tcPr>
             <w:tcW w:type="dxa" w:w="9360"/>
-            <w:shd w:fill="F3F6F7"/>
+            <w:shd w:fill="F5F4FA"/>
             <w:tcMar>
               <w:top w:w="140" w:type="dxa"/>
               <w:start w:w="180" w:type="dxa"/>
@@ -2372,7 +2608,7 @@
               <w:rPr>
                 <w:rFonts w:ascii="Calibri" w:hAnsi="Calibri"/>
                 <w:b/>
-                <w:color w:val="073B4C"/>
+                <w:color w:val="25245B"/>
                 <w:sz w:val="20"/>
               </w:rPr>
               <w:t>Debe ocurrir</w:t>
@@ -2409,7 +2645,7 @@
         <w:rPr>
           <w:rFonts w:ascii="Calibri" w:hAnsi="Calibri"/>
           <w:b/>
-          <w:color w:val="073B4C"/>
+          <w:color w:val="25245B"/>
           <w:sz w:val="26"/>
         </w:rPr>
         <w:t>Paso 4</w:t>
@@ -2443,7 +2679,7 @@
         <w:tc>
           <w:tcPr>
             <w:tcW w:type="dxa" w:w="9360"/>
-            <w:shd w:fill="F3F6F7"/>
+            <w:shd w:fill="F5F4FA"/>
             <w:tcMar>
               <w:top w:w="140" w:type="dxa"/>
               <w:start w:w="180" w:type="dxa"/>
@@ -2459,7 +2695,7 @@
               <w:rPr>
                 <w:rFonts w:ascii="Calibri" w:hAnsi="Calibri"/>
                 <w:b/>
-                <w:color w:val="073B4C"/>
+                <w:color w:val="25245B"/>
                 <w:sz w:val="20"/>
               </w:rPr>
               <w:t>Debe ocurrir</w:t>
@@ -2503,7 +2739,7 @@
         <w:tc>
           <w:tcPr>
             <w:tcW w:type="dxa" w:w="3800"/>
-            <w:shd w:fill="073B4C"/>
+            <w:shd w:fill="25245B"/>
             <w:tcMar>
               <w:top w:w="90" w:type="dxa"/>
               <w:start w:w="120" w:type="dxa"/>
@@ -2530,7 +2766,7 @@
         <w:tc>
           <w:tcPr>
             <w:tcW w:type="dxa" w:w="5560"/>
-            <w:shd w:fill="073B4C"/>
+            <w:shd w:fill="25245B"/>
             <w:tcMar>
               <w:top w:w="90" w:type="dxa"/>
               <w:start w:w="120" w:type="dxa"/>
@@ -2628,7 +2864,7 @@
         <w:rPr>
           <w:rFonts w:ascii="Calibri" w:hAnsi="Calibri"/>
           <w:b/>
-          <w:color w:val="009B77"/>
+          <w:color w:val="339E48"/>
           <w:sz w:val="32"/>
         </w:rPr>
         <w:t>4. Foro, asientos y reservas</w:t>
@@ -2657,7 +2893,7 @@
         <w:rPr>
           <w:rFonts w:ascii="Calibri" w:hAnsi="Calibri"/>
           <w:b/>
-          <w:color w:val="073B4C"/>
+          <w:color w:val="25245B"/>
           <w:sz w:val="26"/>
         </w:rPr>
         <w:t>Paso 1</w:t>
@@ -2691,7 +2927,7 @@
         <w:tc>
           <w:tcPr>
             <w:tcW w:type="dxa" w:w="9360"/>
-            <w:shd w:fill="F3F6F7"/>
+            <w:shd w:fill="F5F4FA"/>
             <w:tcMar>
               <w:top w:w="140" w:type="dxa"/>
               <w:start w:w="180" w:type="dxa"/>
@@ -2707,7 +2943,7 @@
               <w:rPr>
                 <w:rFonts w:ascii="Calibri" w:hAnsi="Calibri"/>
                 <w:b/>
-                <w:color w:val="073B4C"/>
+                <w:color w:val="25245B"/>
                 <w:sz w:val="20"/>
               </w:rPr>
               <w:t>Debe ocurrir</w:t>
@@ -2744,7 +2980,7 @@
         <w:rPr>
           <w:rFonts w:ascii="Calibri" w:hAnsi="Calibri"/>
           <w:b/>
-          <w:color w:val="073B4C"/>
+          <w:color w:val="25245B"/>
           <w:sz w:val="26"/>
         </w:rPr>
         <w:t>Paso 2</w:t>
@@ -2778,7 +3014,7 @@
         <w:tc>
           <w:tcPr>
             <w:tcW w:type="dxa" w:w="9360"/>
-            <w:shd w:fill="F3F6F7"/>
+            <w:shd w:fill="F5F4FA"/>
             <w:tcMar>
               <w:top w:w="140" w:type="dxa"/>
               <w:start w:w="180" w:type="dxa"/>
@@ -2794,7 +3030,7 @@
               <w:rPr>
                 <w:rFonts w:ascii="Calibri" w:hAnsi="Calibri"/>
                 <w:b/>
-                <w:color w:val="073B4C"/>
+                <w:color w:val="25245B"/>
                 <w:sz w:val="20"/>
               </w:rPr>
               <w:t>Debe ocurrir</w:t>
@@ -2831,7 +3067,7 @@
         <w:rPr>
           <w:rFonts w:ascii="Calibri" w:hAnsi="Calibri"/>
           <w:b/>
-          <w:color w:val="073B4C"/>
+          <w:color w:val="25245B"/>
           <w:sz w:val="26"/>
         </w:rPr>
         <w:t>Paso 3</w:t>
@@ -2865,7 +3101,7 @@
         <w:tc>
           <w:tcPr>
             <w:tcW w:type="dxa" w:w="9360"/>
-            <w:shd w:fill="F3F6F7"/>
+            <w:shd w:fill="F5F4FA"/>
             <w:tcMar>
               <w:top w:w="140" w:type="dxa"/>
               <w:start w:w="180" w:type="dxa"/>
@@ -2881,7 +3117,7 @@
               <w:rPr>
                 <w:rFonts w:ascii="Calibri" w:hAnsi="Calibri"/>
                 <w:b/>
-                <w:color w:val="073B4C"/>
+                <w:color w:val="25245B"/>
                 <w:sz w:val="20"/>
               </w:rPr>
               <w:t>Debe ocurrir</w:t>
@@ -2918,7 +3154,7 @@
         <w:rPr>
           <w:rFonts w:ascii="Calibri" w:hAnsi="Calibri"/>
           <w:b/>
-          <w:color w:val="073B4C"/>
+          <w:color w:val="25245B"/>
           <w:sz w:val="26"/>
         </w:rPr>
         <w:t>Paso 4</w:t>
@@ -2952,7 +3188,7 @@
         <w:tc>
           <w:tcPr>
             <w:tcW w:type="dxa" w:w="9360"/>
-            <w:shd w:fill="F3F6F7"/>
+            <w:shd w:fill="F5F4FA"/>
             <w:tcMar>
               <w:top w:w="140" w:type="dxa"/>
               <w:start w:w="180" w:type="dxa"/>
@@ -2968,7 +3204,7 @@
               <w:rPr>
                 <w:rFonts w:ascii="Calibri" w:hAnsi="Calibri"/>
                 <w:b/>
-                <w:color w:val="073B4C"/>
+                <w:color w:val="25245B"/>
                 <w:sz w:val="20"/>
               </w:rPr>
               <w:t>Debe ocurrir</w:t>
@@ -3012,7 +3248,7 @@
         <w:tc>
           <w:tcPr>
             <w:tcW w:type="dxa" w:w="3800"/>
-            <w:shd w:fill="073B4C"/>
+            <w:shd w:fill="25245B"/>
             <w:tcMar>
               <w:top w:w="90" w:type="dxa"/>
               <w:start w:w="120" w:type="dxa"/>
@@ -3039,7 +3275,7 @@
         <w:tc>
           <w:tcPr>
             <w:tcW w:type="dxa" w:w="5560"/>
-            <w:shd w:fill="073B4C"/>
+            <w:shd w:fill="25245B"/>
             <w:tcMar>
               <w:top w:w="90" w:type="dxa"/>
               <w:start w:w="120" w:type="dxa"/>
@@ -3137,7 +3373,7 @@
         <w:rPr>
           <w:rFonts w:ascii="Calibri" w:hAnsi="Calibri"/>
           <w:b/>
-          <w:color w:val="009B77"/>
+          <w:color w:val="339E48"/>
           <w:sz w:val="32"/>
         </w:rPr>
         <w:t>5. Exposición, stands y plano</w:t>
@@ -3166,7 +3402,7 @@
         <w:rPr>
           <w:rFonts w:ascii="Calibri" w:hAnsi="Calibri"/>
           <w:b/>
-          <w:color w:val="073B4C"/>
+          <w:color w:val="25245B"/>
           <w:sz w:val="26"/>
         </w:rPr>
         <w:t>Paso 1</w:t>
@@ -3200,7 +3436,7 @@
         <w:tc>
           <w:tcPr>
             <w:tcW w:type="dxa" w:w="9360"/>
-            <w:shd w:fill="F3F6F7"/>
+            <w:shd w:fill="F5F4FA"/>
             <w:tcMar>
               <w:top w:w="140" w:type="dxa"/>
               <w:start w:w="180" w:type="dxa"/>
@@ -3216,7 +3452,7 @@
               <w:rPr>
                 <w:rFonts w:ascii="Calibri" w:hAnsi="Calibri"/>
                 <w:b/>
-                <w:color w:val="073B4C"/>
+                <w:color w:val="25245B"/>
                 <w:sz w:val="20"/>
               </w:rPr>
               <w:t>Debe ocurrir</w:t>
@@ -3253,7 +3489,7 @@
         <w:rPr>
           <w:rFonts w:ascii="Calibri" w:hAnsi="Calibri"/>
           <w:b/>
-          <w:color w:val="073B4C"/>
+          <w:color w:val="25245B"/>
           <w:sz w:val="26"/>
         </w:rPr>
         <w:t>Paso 2</w:t>
@@ -3287,7 +3523,7 @@
         <w:tc>
           <w:tcPr>
             <w:tcW w:type="dxa" w:w="9360"/>
-            <w:shd w:fill="F3F6F7"/>
+            <w:shd w:fill="F5F4FA"/>
             <w:tcMar>
               <w:top w:w="140" w:type="dxa"/>
               <w:start w:w="180" w:type="dxa"/>
@@ -3303,7 +3539,7 @@
               <w:rPr>
                 <w:rFonts w:ascii="Calibri" w:hAnsi="Calibri"/>
                 <w:b/>
-                <w:color w:val="073B4C"/>
+                <w:color w:val="25245B"/>
                 <w:sz w:val="20"/>
               </w:rPr>
               <w:t>Debe ocurrir</w:t>
@@ -3340,7 +3576,7 @@
         <w:rPr>
           <w:rFonts w:ascii="Calibri" w:hAnsi="Calibri"/>
           <w:b/>
-          <w:color w:val="073B4C"/>
+          <w:color w:val="25245B"/>
           <w:sz w:val="26"/>
         </w:rPr>
         <w:t>Paso 3</w:t>
@@ -3374,7 +3610,7 @@
         <w:tc>
           <w:tcPr>
             <w:tcW w:type="dxa" w:w="9360"/>
-            <w:shd w:fill="F3F6F7"/>
+            <w:shd w:fill="F5F4FA"/>
             <w:tcMar>
               <w:top w:w="140" w:type="dxa"/>
               <w:start w:w="180" w:type="dxa"/>
@@ -3390,7 +3626,7 @@
               <w:rPr>
                 <w:rFonts w:ascii="Calibri" w:hAnsi="Calibri"/>
                 <w:b/>
-                <w:color w:val="073B4C"/>
+                <w:color w:val="25245B"/>
                 <w:sz w:val="20"/>
               </w:rPr>
               <w:t>Debe ocurrir</w:t>
@@ -3427,7 +3663,7 @@
         <w:rPr>
           <w:rFonts w:ascii="Calibri" w:hAnsi="Calibri"/>
           <w:b/>
-          <w:color w:val="073B4C"/>
+          <w:color w:val="25245B"/>
           <w:sz w:val="26"/>
         </w:rPr>
         <w:t>Paso 4</w:t>
@@ -3461,7 +3697,7 @@
         <w:tc>
           <w:tcPr>
             <w:tcW w:type="dxa" w:w="9360"/>
-            <w:shd w:fill="F3F6F7"/>
+            <w:shd w:fill="F5F4FA"/>
             <w:tcMar>
               <w:top w:w="140" w:type="dxa"/>
               <w:start w:w="180" w:type="dxa"/>
@@ -3477,7 +3713,7 @@
               <w:rPr>
                 <w:rFonts w:ascii="Calibri" w:hAnsi="Calibri"/>
                 <w:b/>
-                <w:color w:val="073B4C"/>
+                <w:color w:val="25245B"/>
                 <w:sz w:val="20"/>
               </w:rPr>
               <w:t>Debe ocurrir</w:t>
@@ -3521,7 +3757,7 @@
         <w:tc>
           <w:tcPr>
             <w:tcW w:type="dxa" w:w="3800"/>
-            <w:shd w:fill="073B4C"/>
+            <w:shd w:fill="25245B"/>
             <w:tcMar>
               <w:top w:w="90" w:type="dxa"/>
               <w:start w:w="120" w:type="dxa"/>
@@ -3548,7 +3784,7 @@
         <w:tc>
           <w:tcPr>
             <w:tcW w:type="dxa" w:w="5560"/>
-            <w:shd w:fill="073B4C"/>
+            <w:shd w:fill="25245B"/>
             <w:tcMar>
               <w:top w:w="90" w:type="dxa"/>
               <w:start w:w="120" w:type="dxa"/>
@@ -3646,7 +3882,7 @@
         <w:rPr>
           <w:rFonts w:ascii="Calibri" w:hAnsi="Calibri"/>
           <w:b/>
-          <w:color w:val="009B77"/>
+          <w:color w:val="339E48"/>
           <w:sz w:val="32"/>
         </w:rPr>
         <w:t>6. Acreditación, impresión y check-in</w:t>
@@ -3675,7 +3911,7 @@
         <w:rPr>
           <w:rFonts w:ascii="Calibri" w:hAnsi="Calibri"/>
           <w:b/>
-          <w:color w:val="073B4C"/>
+          <w:color w:val="25245B"/>
           <w:sz w:val="26"/>
         </w:rPr>
         <w:t>Paso 1</w:t>
@@ -3709,7 +3945,7 @@
         <w:tc>
           <w:tcPr>
             <w:tcW w:type="dxa" w:w="9360"/>
-            <w:shd w:fill="F3F6F7"/>
+            <w:shd w:fill="F5F4FA"/>
             <w:tcMar>
               <w:top w:w="140" w:type="dxa"/>
               <w:start w:w="180" w:type="dxa"/>
@@ -3725,7 +3961,7 @@
               <w:rPr>
                 <w:rFonts w:ascii="Calibri" w:hAnsi="Calibri"/>
                 <w:b/>
-                <w:color w:val="073B4C"/>
+                <w:color w:val="25245B"/>
                 <w:sz w:val="20"/>
               </w:rPr>
               <w:t>Debe ocurrir</w:t>
@@ -3762,7 +3998,7 @@
         <w:rPr>
           <w:rFonts w:ascii="Calibri" w:hAnsi="Calibri"/>
           <w:b/>
-          <w:color w:val="073B4C"/>
+          <w:color w:val="25245B"/>
           <w:sz w:val="26"/>
         </w:rPr>
         <w:t>Paso 2</w:t>
@@ -3796,7 +4032,7 @@
         <w:tc>
           <w:tcPr>
             <w:tcW w:type="dxa" w:w="9360"/>
-            <w:shd w:fill="F3F6F7"/>
+            <w:shd w:fill="F5F4FA"/>
             <w:tcMar>
               <w:top w:w="140" w:type="dxa"/>
               <w:start w:w="180" w:type="dxa"/>
@@ -3812,7 +4048,7 @@
               <w:rPr>
                 <w:rFonts w:ascii="Calibri" w:hAnsi="Calibri"/>
                 <w:b/>
-                <w:color w:val="073B4C"/>
+                <w:color w:val="25245B"/>
                 <w:sz w:val="20"/>
               </w:rPr>
               <w:t>Debe ocurrir</w:t>
@@ -3849,7 +4085,7 @@
         <w:rPr>
           <w:rFonts w:ascii="Calibri" w:hAnsi="Calibri"/>
           <w:b/>
-          <w:color w:val="073B4C"/>
+          <w:color w:val="25245B"/>
           <w:sz w:val="26"/>
         </w:rPr>
         <w:t>Paso 3</w:t>
@@ -3883,7 +4119,7 @@
         <w:tc>
           <w:tcPr>
             <w:tcW w:type="dxa" w:w="9360"/>
-            <w:shd w:fill="F3F6F7"/>
+            <w:shd w:fill="F5F4FA"/>
             <w:tcMar>
               <w:top w:w="140" w:type="dxa"/>
               <w:start w:w="180" w:type="dxa"/>
@@ -3899,7 +4135,7 @@
               <w:rPr>
                 <w:rFonts w:ascii="Calibri" w:hAnsi="Calibri"/>
                 <w:b/>
-                <w:color w:val="073B4C"/>
+                <w:color w:val="25245B"/>
                 <w:sz w:val="20"/>
               </w:rPr>
               <w:t>Debe ocurrir</w:t>
@@ -3936,7 +4172,7 @@
         <w:rPr>
           <w:rFonts w:ascii="Calibri" w:hAnsi="Calibri"/>
           <w:b/>
-          <w:color w:val="073B4C"/>
+          <w:color w:val="25245B"/>
           <w:sz w:val="26"/>
         </w:rPr>
         <w:t>Paso 4</w:t>
@@ -3970,7 +4206,7 @@
         <w:tc>
           <w:tcPr>
             <w:tcW w:type="dxa" w:w="9360"/>
-            <w:shd w:fill="F3F6F7"/>
+            <w:shd w:fill="F5F4FA"/>
             <w:tcMar>
               <w:top w:w="140" w:type="dxa"/>
               <w:start w:w="180" w:type="dxa"/>
@@ -3986,7 +4222,7 @@
               <w:rPr>
                 <w:rFonts w:ascii="Calibri" w:hAnsi="Calibri"/>
                 <w:b/>
-                <w:color w:val="073B4C"/>
+                <w:color w:val="25245B"/>
                 <w:sz w:val="20"/>
               </w:rPr>
               <w:t>Debe ocurrir</w:t>
@@ -4030,7 +4266,7 @@
         <w:tc>
           <w:tcPr>
             <w:tcW w:type="dxa" w:w="3800"/>
-            <w:shd w:fill="073B4C"/>
+            <w:shd w:fill="25245B"/>
             <w:tcMar>
               <w:top w:w="90" w:type="dxa"/>
               <w:start w:w="120" w:type="dxa"/>
@@ -4057,7 +4293,7 @@
         <w:tc>
           <w:tcPr>
             <w:tcW w:type="dxa" w:w="5560"/>
-            <w:shd w:fill="073B4C"/>
+            <w:shd w:fill="25245B"/>
             <w:tcMar>
               <w:top w:w="90" w:type="dxa"/>
               <w:start w:w="120" w:type="dxa"/>
@@ -4155,7 +4391,7 @@
         <w:rPr>
           <w:rFonts w:ascii="Calibri" w:hAnsi="Calibri"/>
           <w:b/>
-          <w:color w:val="009B77"/>
+          <w:color w:val="339E48"/>
           <w:sz w:val="32"/>
         </w:rPr>
         <w:t>7. Portal del expositor, patrocinantes y visitantes</w:t>
@@ -4184,7 +4420,7 @@
         <w:rPr>
           <w:rFonts w:ascii="Calibri" w:hAnsi="Calibri"/>
           <w:b/>
-          <w:color w:val="073B4C"/>
+          <w:color w:val="25245B"/>
           <w:sz w:val="26"/>
         </w:rPr>
         <w:t>Paso 1</w:t>
@@ -4218,7 +4454,7 @@
         <w:tc>
           <w:tcPr>
             <w:tcW w:type="dxa" w:w="9360"/>
-            <w:shd w:fill="F3F6F7"/>
+            <w:shd w:fill="F5F4FA"/>
             <w:tcMar>
               <w:top w:w="140" w:type="dxa"/>
               <w:start w:w="180" w:type="dxa"/>
@@ -4234,7 +4470,7 @@
               <w:rPr>
                 <w:rFonts w:ascii="Calibri" w:hAnsi="Calibri"/>
                 <w:b/>
-                <w:color w:val="073B4C"/>
+                <w:color w:val="25245B"/>
                 <w:sz w:val="20"/>
               </w:rPr>
               <w:t>Debe ocurrir</w:t>
@@ -4271,7 +4507,7 @@
         <w:rPr>
           <w:rFonts w:ascii="Calibri" w:hAnsi="Calibri"/>
           <w:b/>
-          <w:color w:val="073B4C"/>
+          <w:color w:val="25245B"/>
           <w:sz w:val="26"/>
         </w:rPr>
         <w:t>Paso 2</w:t>
@@ -4305,7 +4541,7 @@
         <w:tc>
           <w:tcPr>
             <w:tcW w:type="dxa" w:w="9360"/>
-            <w:shd w:fill="F3F6F7"/>
+            <w:shd w:fill="F5F4FA"/>
             <w:tcMar>
               <w:top w:w="140" w:type="dxa"/>
               <w:start w:w="180" w:type="dxa"/>
@@ -4321,7 +4557,7 @@
               <w:rPr>
                 <w:rFonts w:ascii="Calibri" w:hAnsi="Calibri"/>
                 <w:b/>
-                <w:color w:val="073B4C"/>
+                <w:color w:val="25245B"/>
                 <w:sz w:val="20"/>
               </w:rPr>
               <w:t>Debe ocurrir</w:t>
@@ -4358,7 +4594,7 @@
         <w:rPr>
           <w:rFonts w:ascii="Calibri" w:hAnsi="Calibri"/>
           <w:b/>
-          <w:color w:val="073B4C"/>
+          <w:color w:val="25245B"/>
           <w:sz w:val="26"/>
         </w:rPr>
         <w:t>Paso 3</w:t>
@@ -4392,7 +4628,7 @@
         <w:tc>
           <w:tcPr>
             <w:tcW w:type="dxa" w:w="9360"/>
-            <w:shd w:fill="F3F6F7"/>
+            <w:shd w:fill="F5F4FA"/>
             <w:tcMar>
               <w:top w:w="140" w:type="dxa"/>
               <w:start w:w="180" w:type="dxa"/>
@@ -4408,7 +4644,7 @@
               <w:rPr>
                 <w:rFonts w:ascii="Calibri" w:hAnsi="Calibri"/>
                 <w:b/>
-                <w:color w:val="073B4C"/>
+                <w:color w:val="25245B"/>
                 <w:sz w:val="20"/>
               </w:rPr>
               <w:t>Debe ocurrir</w:t>
@@ -4445,7 +4681,7 @@
         <w:rPr>
           <w:rFonts w:ascii="Calibri" w:hAnsi="Calibri"/>
           <w:b/>
-          <w:color w:val="073B4C"/>
+          <w:color w:val="25245B"/>
           <w:sz w:val="26"/>
         </w:rPr>
         <w:t>Paso 4</w:t>
@@ -4479,7 +4715,7 @@
         <w:tc>
           <w:tcPr>
             <w:tcW w:type="dxa" w:w="9360"/>
-            <w:shd w:fill="F3F6F7"/>
+            <w:shd w:fill="F5F4FA"/>
             <w:tcMar>
               <w:top w:w="140" w:type="dxa"/>
               <w:start w:w="180" w:type="dxa"/>
@@ -4495,7 +4731,7 @@
               <w:rPr>
                 <w:rFonts w:ascii="Calibri" w:hAnsi="Calibri"/>
                 <w:b/>
-                <w:color w:val="073B4C"/>
+                <w:color w:val="25245B"/>
                 <w:sz w:val="20"/>
               </w:rPr>
               <w:t>Debe ocurrir</w:t>
@@ -4539,7 +4775,7 @@
         <w:tc>
           <w:tcPr>
             <w:tcW w:type="dxa" w:w="3800"/>
-            <w:shd w:fill="073B4C"/>
+            <w:shd w:fill="25245B"/>
             <w:tcMar>
               <w:top w:w="90" w:type="dxa"/>
               <w:start w:w="120" w:type="dxa"/>
@@ -4566,7 +4802,7 @@
         <w:tc>
           <w:tcPr>
             <w:tcW w:type="dxa" w:w="5560"/>
-            <w:shd w:fill="073B4C"/>
+            <w:shd w:fill="25245B"/>
             <w:tcMar>
               <w:top w:w="90" w:type="dxa"/>
               <w:start w:w="120" w:type="dxa"/>
@@ -4664,7 +4900,7 @@
         <w:rPr>
           <w:rFonts w:ascii="Calibri" w:hAnsi="Calibri"/>
           <w:b/>
-          <w:color w:val="009B77"/>
+          <w:color w:val="339E48"/>
           <w:sz w:val="32"/>
         </w:rPr>
         <w:t>Reporte de errores y observaciones</w:t>
@@ -4693,7 +4929,7 @@
         <w:rPr>
           <w:rFonts w:ascii="Calibri" w:hAnsi="Calibri"/>
           <w:b/>
-          <w:color w:val="073B4C"/>
+          <w:color w:val="25245B"/>
           <w:sz w:val="26"/>
         </w:rPr>
         <w:t>Incidencia 1</w:t>
@@ -4715,7 +4951,7 @@
         <w:tc>
           <w:tcPr>
             <w:tcW w:type="dxa" w:w="2800"/>
-            <w:shd w:fill="073B4C"/>
+            <w:shd w:fill="25245B"/>
             <w:tcMar>
               <w:top w:w="90" w:type="dxa"/>
               <w:start w:w="120" w:type="dxa"/>
@@ -4742,7 +4978,7 @@
         <w:tc>
           <w:tcPr>
             <w:tcW w:type="dxa" w:w="6560"/>
-            <w:shd w:fill="073B4C"/>
+            <w:shd w:fill="25245B"/>
             <w:tcMar>
               <w:top w:w="90" w:type="dxa"/>
               <w:start w:w="120" w:type="dxa"/>
@@ -5261,7 +5497,7 @@
         <w:rPr>
           <w:rFonts w:ascii="Calibri" w:hAnsi="Calibri"/>
           <w:b/>
-          <w:color w:val="073B4C"/>
+          <w:color w:val="25245B"/>
           <w:sz w:val="26"/>
         </w:rPr>
         <w:t>Incidencia 2</w:t>
@@ -5283,7 +5519,7 @@
         <w:tc>
           <w:tcPr>
             <w:tcW w:type="dxa" w:w="2800"/>
-            <w:shd w:fill="073B4C"/>
+            <w:shd w:fill="25245B"/>
             <w:tcMar>
               <w:top w:w="90" w:type="dxa"/>
               <w:start w:w="120" w:type="dxa"/>
@@ -5310,7 +5546,7 @@
         <w:tc>
           <w:tcPr>
             <w:tcW w:type="dxa" w:w="6560"/>
-            <w:shd w:fill="073B4C"/>
+            <w:shd w:fill="25245B"/>
             <w:tcMar>
               <w:top w:w="90" w:type="dxa"/>
               <w:start w:w="120" w:type="dxa"/>
@@ -5829,7 +6065,7 @@
         <w:rPr>
           <w:rFonts w:ascii="Calibri" w:hAnsi="Calibri"/>
           <w:b/>
-          <w:color w:val="073B4C"/>
+          <w:color w:val="25245B"/>
           <w:sz w:val="26"/>
         </w:rPr>
         <w:t>Incidencia 3</w:t>
@@ -5851,7 +6087,7 @@
         <w:tc>
           <w:tcPr>
             <w:tcW w:type="dxa" w:w="2800"/>
-            <w:shd w:fill="073B4C"/>
+            <w:shd w:fill="25245B"/>
             <w:tcMar>
               <w:top w:w="90" w:type="dxa"/>
               <w:start w:w="120" w:type="dxa"/>
@@ -5878,7 +6114,7 @@
         <w:tc>
           <w:tcPr>
             <w:tcW w:type="dxa" w:w="6560"/>
-            <w:shd w:fill="073B4C"/>
+            <w:shd w:fill="25245B"/>
             <w:tcMar>
               <w:top w:w="90" w:type="dxa"/>
               <w:start w:w="120" w:type="dxa"/>
@@ -6402,7 +6638,7 @@
         <w:rPr>
           <w:rFonts w:ascii="Calibri" w:hAnsi="Calibri"/>
           <w:b/>
-          <w:color w:val="009B77"/>
+          <w:color w:val="339E48"/>
           <w:sz w:val="32"/>
         </w:rPr>
         <w:t>Cierre de evaluación</w:t>
@@ -6438,7 +6674,7 @@
         <w:tc>
           <w:tcPr>
             <w:tcW w:type="dxa" w:w="3600"/>
-            <w:shd w:fill="073B4C"/>
+            <w:shd w:fill="25245B"/>
             <w:tcMar>
               <w:top w:w="90" w:type="dxa"/>
               <w:start w:w="120" w:type="dxa"/>
@@ -6465,7 +6701,7 @@
         <w:tc>
           <w:tcPr>
             <w:tcW w:type="dxa" w:w="5760"/>
-            <w:shd w:fill="073B4C"/>
+            <w:shd w:fill="25245B"/>
             <w:tcMar>
               <w:top w:w="90" w:type="dxa"/>
               <w:start w:w="120" w:type="dxa"/>
@@ -6776,7 +7012,7 @@
         <w:tc>
           <w:tcPr>
             <w:tcW w:type="dxa" w:w="9360"/>
-            <w:shd w:fill="E8F7F2"/>
+            <w:shd w:fill="EDF8EF"/>
             <w:tcMar>
               <w:top w:w="140" w:type="dxa"/>
               <w:start w:w="180" w:type="dxa"/>
@@ -6792,7 +7028,7 @@
               <w:rPr>
                 <w:rFonts w:ascii="Calibri" w:hAnsi="Calibri"/>
                 <w:b/>
-                <w:color w:val="073B4C"/>
+                <w:color w:val="25245B"/>
                 <w:sz w:val="20"/>
               </w:rPr>
               <w:t>Entrega sugerida</w:t>
@@ -6868,7 +7104,7 @@
         <w:color w:val="5B6770"/>
         <w:sz w:val="16"/>
       </w:rPr>
-      <w:t>EVENTPASS VE  |  GUÍA DE PRUEBAS PARA CLIENTE</w:t>
+      <w:t>EXPO VENEZUELA ENERGÉTICA 2026  |  GUÍA DE PRUEBAS</w:t>
     </w:r>
   </w:p>
 </w:hdr>

</xml_diff>